<commit_message>
Connect blog generator to web
</commit_message>
<xml_diff>
--- a/downloads/advertisement.docx
+++ b/downloads/advertisement.docx
@@ -14,37 +14,37 @@
       <w:r>
         <w:t xml:space="preserve">1.  </w:t>
         <w:br/>
-        <w:t xml:space="preserve">피로가 쌓인 하루 끝, **7데이즈**에서 품격 있는 힐링을 경험하세요.  </w:t>
+        <w:t xml:space="preserve">**하루의 피로를 품격 있게 풀어내는 시간**  </w:t>
         <w:br/>
-        <w:t>친절한 케어와 고급스러운 공간에서 몸과 마음이 편안해집니다.</w:t>
+        <w:t>고급스러운 공간, 친절한 케어가 함께하는 **7데이즈**에서 편안한 힐링을 경험해보세요.</w:t>
         <w:br/>
         <w:br/>
         <w:t xml:space="preserve">2.  </w:t>
         <w:br/>
-        <w:t xml:space="preserve">나를 위한 가장 부드러운 휴식, **7데이즈 마사지샵**.  </w:t>
+        <w:t xml:space="preserve">**지친 몸과 마음에 선물하는 특별한 휴식**  </w:t>
         <w:br/>
-        <w:t>섬세한 손길과 따뜻한 서비스로 특별한 힐링 시간을 선물해드립니다.</w:t>
+        <w:t>섬세한 손길과 아늑한 분위기의 마사지샵 **7데이즈**에서 오늘의 피로를 내려놓으세요.</w:t>
         <w:br/>
         <w:br/>
         <w:t xml:space="preserve">3.  </w:t>
         <w:br/>
-        <w:t xml:space="preserve">바쁜 일상 속 작은 럭셔리, **7데이즈**.  </w:t>
+        <w:t xml:space="preserve">**프리미엄 힐링, 7데이즈에서 시작하세요**  </w:t>
         <w:br/>
-        <w:t>편안한 분위기와 정성스러운 케어로 지친 몸을 가볍게 풀어보세요.</w:t>
+        <w:t>고급스러운 분위기와 친절한 응대로 완성되는 편안한 마사지 시간. 지금 예약해보세요.</w:t>
         <w:br/>
         <w:br/>
         <w:t xml:space="preserve">4.  </w:t>
         <w:br/>
-        <w:t xml:space="preserve">고급스러운 공간, 친절한 응대, 만족스러운 관리.  </w:t>
+        <w:t xml:space="preserve">**매일이 편안해지는 공간, 7데이즈**  </w:t>
         <w:br/>
-        <w:t>매일 찾고 싶은 프리미엄 힐링 플레이스, **7데이즈**에서 쉬어가세요.</w:t>
+        <w:t>바쁜 일상 속 잠시 멈춤이 필요할 때, 품격 있는 마사지 케어로 몸과 마음을 가볍게 만들어드립니다.</w:t>
         <w:br/>
         <w:br/>
         <w:t xml:space="preserve">5.  </w:t>
         <w:br/>
-        <w:t xml:space="preserve">오늘의 피로는 오늘 풀어야 하니까.  </w:t>
+        <w:t xml:space="preserve">**친절함이 느껴지는 프리미엄 마사지샵**  </w:t>
         <w:br/>
-        <w:t>**7데이즈**에서 전문적인 케어와 편안한 휴식으로 새로운 에너지를 채워보세요.</w:t>
+        <w:t>편안한 휴식과 세심한 케어를 원하신다면 **7데이즈**. 고급스러운 힐링을 지금 만나보세요.</w:t>
       </w:r>
     </w:p>
     <w:sectPr>

</xml_diff>

<commit_message>
Optimize marketing package for Render Free
</commit_message>
<xml_diff>
--- a/downloads/advertisement.docx
+++ b/downloads/advertisement.docx
@@ -14,7 +14,7 @@
       <w:r>
         <w:drawing>
           <wp:inline xmlns:a="http://schemas.openxmlformats.org/drawingml/2006/main" xmlns:pic="http://schemas.openxmlformats.org/drawingml/2006/picture">
-            <wp:extent cx="5029200" cy="3352800"/>
+            <wp:extent cx="5029200" cy="5029200"/>
             <wp:docPr id="1" name="Picture 1"/>
             <wp:cNvGraphicFramePr>
               <a:graphicFrameLocks noChangeAspect="1"/>
@@ -23,7 +23,7 @@
               <a:graphicData uri="http://schemas.openxmlformats.org/drawingml/2006/picture">
                 <pic:pic>
                   <pic:nvPicPr>
-                    <pic:cNvPr id="0" name="image_20260810_172200_39fe4e17.png"/>
+                    <pic:cNvPr id="0" name="image_20260810_182130_1498877a.jpg"/>
                     <pic:cNvPicPr/>
                   </pic:nvPicPr>
                   <pic:blipFill>
@@ -35,7 +35,7 @@
                   <pic:spPr>
                     <a:xfrm>
                       <a:off x="0" y="0"/>
-                      <a:ext cx="5029200" cy="3352800"/>
+                      <a:ext cx="5029200" cy="5029200"/>
                     </a:xfrm>
                     <a:prstGeom prst="rect"/>
                   </pic:spPr>
@@ -48,27 +48,19 @@
     </w:p>
     <w:p>
       <w:r>
-        <w:t xml:space="preserve">1. **월화수목금토일, 피로는 매일 오니까!**  </w:t>
+        <w:t xml:space="preserve">1. **월화수목금토일, 피로는 7day’s에서 퇴근!**  </w:t>
         <w:br/>
-        <w:t xml:space="preserve">   **7days massage**에서 매일매일 말랑해지는 기분을 만나보세요.  </w:t>
-        <w:br/>
-        <w:t xml:space="preserve">   뭉친 어깨도, 굳은 마음도 “아~ 살겠다!”</w:t>
+        <w:t xml:space="preserve">   일주일 내내 쌓인 뻐근함, 오늘은 마사지로 시원하게 풀어보세요.</w:t>
         <w:br/>
         <w:br/>
-        <w:t xml:space="preserve">2. **내 몸이 보내는 SOS, 못 들은 척하지 마세요!**  </w:t>
+        <w:t xml:space="preserve">2. **어깨가 돌덩이세요? 7day’s가 말랑하게 바꿔드립니다!**  </w:t>
         <w:br/>
-        <w:t xml:space="preserve">   어깨: “나 좀 풀어줘…”  </w:t>
-        <w:br/>
-        <w:t xml:space="preserve">   허리: “나도…”  </w:t>
-        <w:br/>
-        <w:t xml:space="preserve">   정답은? **7days massage**에서 시원하게 힐링!</w:t>
+        <w:t xml:space="preserve">   굳은 몸도, 지친 마음도 재미있게 풀리는 힐링 타임.</w:t>
         <w:br/>
         <w:br/>
-        <w:t xml:space="preserve">3. **피로야, 우리 이제 그만 만나자!**  </w:t>
+        <w:t xml:space="preserve">3. **피로가 출근했다면, 마사지는 7day’s로 출동!**  </w:t>
         <w:br/>
-        <w:t xml:space="preserve">   웃음은 덤, 힐링은 제대로.  </w:t>
-        <w:br/>
-        <w:t xml:space="preserve">   사랑스럽게 지친 당신을 풀어주는 곳, **7days massage**.</w:t>
+        <w:t xml:space="preserve">   매일매일 가볍게, 기분 좋게 리셋하세요.</w:t>
       </w:r>
     </w:p>
     <w:sectPr>

</xml_diff>

<commit_message>
Improve marketing images and add PDF emoji support
</commit_message>
<xml_diff>
--- a/downloads/advertisement.docx
+++ b/downloads/advertisement.docx
@@ -12,55 +12,19 @@
     </w:p>
     <w:p>
       <w:r>
-        <w:drawing>
-          <wp:inline xmlns:a="http://schemas.openxmlformats.org/drawingml/2006/main" xmlns:pic="http://schemas.openxmlformats.org/drawingml/2006/picture">
-            <wp:extent cx="5029200" cy="5029200"/>
-            <wp:docPr id="1" name="Picture 1"/>
-            <wp:cNvGraphicFramePr>
-              <a:graphicFrameLocks noChangeAspect="1"/>
-            </wp:cNvGraphicFramePr>
-            <a:graphic>
-              <a:graphicData uri="http://schemas.openxmlformats.org/drawingml/2006/picture">
-                <pic:pic>
-                  <pic:nvPicPr>
-                    <pic:cNvPr id="0" name="image_20260810_182130_1498877a.jpg"/>
-                    <pic:cNvPicPr/>
-                  </pic:nvPicPr>
-                  <pic:blipFill>
-                    <a:blip r:embed="rId9"/>
-                    <a:stretch>
-                      <a:fillRect/>
-                    </a:stretch>
-                  </pic:blipFill>
-                  <pic:spPr>
-                    <a:xfrm>
-                      <a:off x="0" y="0"/>
-                      <a:ext cx="5029200" cy="5029200"/>
-                    </a:xfrm>
-                    <a:prstGeom prst="rect"/>
-                  </pic:spPr>
-                </pic:pic>
-              </a:graphicData>
-            </a:graphic>
-          </wp:inline>
-        </w:drawing>
-      </w:r>
-    </w:p>
-    <w:p>
-      <w:r>
-        <w:t xml:space="preserve">1. **월화수목금토일, 피로는 7day’s에서 퇴근!**  </w:t>
+        <w:t xml:space="preserve">1. **월화수목금토일, 피로는 7day’s massage에서 로그아웃!**  </w:t>
         <w:br/>
-        <w:t xml:space="preserve">   일주일 내내 쌓인 뻐근함, 오늘은 마사지로 시원하게 풀어보세요.</w:t>
+        <w:t xml:space="preserve">   오늘 쌓인 뻐근함, 내일로 미루지 마세요.</w:t>
         <w:br/>
         <w:br/>
-        <w:t xml:space="preserve">2. **어깨가 돌덩이세요? 7day’s가 말랑하게 바꿔드립니다!**  </w:t>
+        <w:t xml:space="preserve">2. **어깨가 돌덩이? 저희가 말랑하게 해드릴게요!**  </w:t>
         <w:br/>
-        <w:t xml:space="preserve">   굳은 몸도, 지친 마음도 재미있게 풀리는 힐링 타임.</w:t>
+        <w:t xml:space="preserve">   7day’s massage에서 몸도 기분도 가볍게 풀어보세요.</w:t>
         <w:br/>
         <w:br/>
-        <w:t xml:space="preserve">3. **피로가 출근했다면, 마사지는 7day’s로 출동!**  </w:t>
+        <w:t xml:space="preserve">3. **일주일 내내 피곤한 당신을 위한 7일 처방전!**  </w:t>
         <w:br/>
-        <w:t xml:space="preserve">   매일매일 가볍게, 기분 좋게 리셋하세요.</w:t>
+        <w:t xml:space="preserve">   뭉친 근육엔 고민 말고, 7day’s massage.</w:t>
       </w:r>
     </w:p>
     <w:sectPr>

</xml_diff>

<commit_message>
Add brand history and package progress UI
</commit_message>
<xml_diff>
--- a/downloads/advertisement.docx
+++ b/downloads/advertisement.docx
@@ -12,19 +12,55 @@
     </w:p>
     <w:p>
       <w:r>
-        <w:t xml:space="preserve">1. **월화수목금토일, 피로는 7day’s massage에서 로그아웃!**  </w:t>
+        <w:drawing>
+          <wp:inline xmlns:a="http://schemas.openxmlformats.org/drawingml/2006/main" xmlns:pic="http://schemas.openxmlformats.org/drawingml/2006/picture">
+            <wp:extent cx="5029200" cy="5029200"/>
+            <wp:docPr id="1" name="Picture 1"/>
+            <wp:cNvGraphicFramePr>
+              <a:graphicFrameLocks noChangeAspect="1"/>
+            </wp:cNvGraphicFramePr>
+            <a:graphic>
+              <a:graphicData uri="http://schemas.openxmlformats.org/drawingml/2006/picture">
+                <pic:pic>
+                  <pic:nvPicPr>
+                    <pic:cNvPr id="0" name="image_20260810_191159_54b421a5.jpg"/>
+                    <pic:cNvPicPr/>
+                  </pic:nvPicPr>
+                  <pic:blipFill>
+                    <a:blip r:embed="rId9"/>
+                    <a:stretch>
+                      <a:fillRect/>
+                    </a:stretch>
+                  </pic:blipFill>
+                  <pic:spPr>
+                    <a:xfrm>
+                      <a:off x="0" y="0"/>
+                      <a:ext cx="5029200" cy="5029200"/>
+                    </a:xfrm>
+                    <a:prstGeom prst="rect"/>
+                  </pic:spPr>
+                </pic:pic>
+              </a:graphicData>
+            </a:graphic>
+          </wp:inline>
+        </w:drawing>
+      </w:r>
+    </w:p>
+    <w:p>
+      <w:r>
+        <w:t xml:space="preserve">1. **월화수목금토일, 피로는 쉬는 날 없으니까!**  </w:t>
         <w:br/>
-        <w:t xml:space="preserve">   오늘 쌓인 뻐근함, 내일로 미루지 마세요.</w:t>
+        <w:t xml:space="preserve">   매일매일 시원하게 풀어주는 **7day's massage**</w:t>
         <w:br/>
         <w:br/>
-        <w:t xml:space="preserve">2. **어깨가 돌덩이? 저희가 말랑하게 해드릴게요!**  </w:t>
+        <w:t xml:space="preserve">2. **뭉친 어깨가 “살려줘…” 할 때!**  </w:t>
         <w:br/>
-        <w:t xml:space="preserve">   7day’s massage에서 몸도 기분도 가볍게 풀어보세요.</w:t>
+        <w:t xml:space="preserve">   고민 말고 바로 오세요, **7day's massage**에서 말랑하게 풀어드립니다.</w:t>
         <w:br/>
         <w:br/>
-        <w:t xml:space="preserve">3. **일주일 내내 피곤한 당신을 위한 7일 처방전!**  </w:t>
+        <w:t xml:space="preserve">3. **피로 퇴근 버튼, 여기 있습니다.**  </w:t>
         <w:br/>
-        <w:t xml:space="preserve">   뭉친 근육엔 고민 말고, 7day’s massage.</w:t>
+        <w:t xml:space="preserve">   하루의 무게를 가볍게 만드는 시간, **7day's massage**</w:t>
       </w:r>
     </w:p>
     <w:sectPr>

</xml_diff>

<commit_message>
Add history downloads and branded image styles
</commit_message>
<xml_diff>
--- a/downloads/advertisement.docx
+++ b/downloads/advertisement.docx
@@ -23,7 +23,7 @@
               <a:graphicData uri="http://schemas.openxmlformats.org/drawingml/2006/picture">
                 <pic:pic>
                   <pic:nvPicPr>
-                    <pic:cNvPr id="0" name="image_20260810_191159_54b421a5.jpg"/>
+                    <pic:cNvPr id="0" name="image_20260811_133059_74c53f4c.jpg"/>
                     <pic:cNvPicPr/>
                   </pic:nvPicPr>
                   <pic:blipFill>
@@ -48,19 +48,25 @@
     </w:p>
     <w:p>
       <w:r>
-        <w:t xml:space="preserve">1. **월화수목금토일, 피로는 쉬는 날 없으니까!**  </w:t>
+        <w:t xml:space="preserve">1. **월화수목금토일, 피로는 쉬는 날 없음!**  </w:t>
         <w:br/>
-        <w:t xml:space="preserve">   매일매일 시원하게 풀어주는 **7day's massage**</w:t>
+        <w:t xml:space="preserve">   그래서 **7day's massage**도 매일 준비 완료.  </w:t>
+        <w:br/>
+        <w:t xml:space="preserve">   오늘 쌓인 피로, 오늘 바로 풀어드릴게요!</w:t>
         <w:br/>
         <w:br/>
-        <w:t xml:space="preserve">2. **뭉친 어깨가 “살려줘…” 할 때!**  </w:t>
+        <w:t xml:space="preserve">2. **어깨가 “살려줘…”라고 말한다면?**  </w:t>
         <w:br/>
-        <w:t xml:space="preserve">   고민 말고 바로 오세요, **7day's massage**에서 말랑하게 풀어드립니다.</w:t>
+        <w:t xml:space="preserve">   고민 말고 **7day's massage**로 오세요.  </w:t>
+        <w:br/>
+        <w:t xml:space="preserve">   뭉친 근육은 풀고, 기분은 업!</w:t>
         <w:br/>
         <w:br/>
-        <w:t xml:space="preserve">3. **피로 퇴근 버튼, 여기 있습니다.**  </w:t>
+        <w:t xml:space="preserve">3. **피로 퇴근시키는 가장 쉬운 방법**  </w:t>
         <w:br/>
-        <w:t xml:space="preserve">   하루의 무게를 가볍게 만드는 시간, **7day's massage**</w:t>
+        <w:t xml:space="preserve">   출근한 피로, 야근한 스트레스까지  </w:t>
+        <w:br/>
+        <w:t xml:space="preserve">   **7day's massage**에서 시원하게 퇴근 완료!</w:t>
       </w:r>
     </w:p>
     <w:sectPr>

</xml_diff>

<commit_message>
Add user accounts, user data separation, industry images and auto taglines
</commit_message>
<xml_diff>
--- a/downloads/advertisement.docx
+++ b/downloads/advertisement.docx
@@ -23,7 +23,7 @@
               <a:graphicData uri="http://schemas.openxmlformats.org/drawingml/2006/picture">
                 <pic:pic>
                   <pic:nvPicPr>
-                    <pic:cNvPr id="0" name="image_20260811_134155_1f2fd2b1.jpg"/>
+                    <pic:cNvPr id="0" name="image_20260812_081041_9d3a526a.jpg"/>
                     <pic:cNvPicPr/>
                   </pic:nvPicPr>
                   <pic:blipFill>
@@ -48,19 +48,25 @@
     </w:p>
     <w:p>
       <w:r>
-        <w:t xml:space="preserve">1. **월화수목금토일, 뭉친 곳엔 7day's massage!**  </w:t>
+        <w:t xml:space="preserve">1. **월화수목금토일, 뭉친 피로는 7day’s가 책임질게요!**  </w:t>
         <w:br/>
-        <w:t xml:space="preserve">   피로가 출근하면, 우리는 마사지로 퇴근시켜드립니다.</w:t>
+        <w:t xml:space="preserve">   웃음은 가볍게, 몸은 더 가볍게.  </w:t>
+        <w:br/>
+        <w:t xml:space="preserve">   오늘도 사랑스럽게 풀어드리는 **7day’s massage** 💆‍♀️</w:t>
         <w:br/>
         <w:br/>
-        <w:t xml:space="preserve">2. **어깨가 돌덩이세요? 7day's massage가 조각해드릴게요!**  </w:t>
+        <w:t xml:space="preserve">2. **어깨가 “살려줘…”라고 말할 때!**  </w:t>
         <w:br/>
-        <w:t xml:space="preserve">   뭉친 근육은 풀고, 기분은 말랑하게.</w:t>
+        <w:t xml:space="preserve">   참지 말고 7day’s massage로 오세요.  </w:t>
+        <w:br/>
+        <w:t xml:space="preserve">   뭉친 근육도, 지친 마음도 기분 좋게 풀어드립니다!</w:t>
         <w:br/>
         <w:br/>
-        <w:t xml:space="preserve">3. **피로야, 너 오늘 예약 취소야!**  </w:t>
+        <w:t xml:space="preserve">3. **피로야, 너 오늘 퇴근이다!**  </w:t>
         <w:br/>
-        <w:t xml:space="preserve">   7day's massage에서 7일 내내 개운한 하루를 만나보세요.</w:t>
+        <w:t xml:space="preserve">   매일매일 받고 싶은 편안함,  </w:t>
+        <w:br/>
+        <w:t xml:space="preserve">   7일 내내 기분 좋아지는 곳 **7day’s massage** ✨</w:t>
       </w:r>
     </w:p>
     <w:sectPr>

</xml_diff>

<commit_message>
Add plan system dashboard and saved brand picker
</commit_message>
<xml_diff>
--- a/downloads/advertisement.docx
+++ b/downloads/advertisement.docx
@@ -23,7 +23,7 @@
               <a:graphicData uri="http://schemas.openxmlformats.org/drawingml/2006/picture">
                 <pic:pic>
                   <pic:nvPicPr>
-                    <pic:cNvPr id="0" name="image_20260812_081041_9d3a526a.jpg"/>
+                    <pic:cNvPr id="0" name="image_20260812_200343_30670e4a.jpg"/>
                     <pic:cNvPicPr/>
                   </pic:nvPicPr>
                   <pic:blipFill>
@@ -48,25 +48,25 @@
     </w:p>
     <w:p>
       <w:r>
-        <w:t xml:space="preserve">1. **월화수목금토일, 뭉친 피로는 7day’s가 책임질게요!**  </w:t>
+        <w:t xml:space="preserve">1. **머물수록 기분 좋은 곳, 별다방**  </w:t>
         <w:br/>
-        <w:t xml:space="preserve">   웃음은 가볍게, 몸은 더 가볍게.  </w:t>
+        <w:t xml:space="preserve">   깨끗한 공간, 향긋한 커피, 달콤한 디저트까지.  </w:t>
         <w:br/>
-        <w:t xml:space="preserve">   오늘도 사랑스럽게 풀어드리는 **7day’s massage** 💆‍♀️</w:t>
+        <w:t xml:space="preserve">   오늘도 오래 있고 싶은 카페, 별다방입니다.</w:t>
         <w:br/>
         <w:br/>
-        <w:t xml:space="preserve">2. **어깨가 “살려줘…”라고 말할 때!**  </w:t>
+        <w:t xml:space="preserve">2. **커피 한 잔에 달콤한 여유를 더하다**  </w:t>
         <w:br/>
-        <w:t xml:space="preserve">   참지 말고 7day’s massage로 오세요.  </w:t>
+        <w:t xml:space="preserve">   맛있는 커피와 다양한 디저트, 친절한 미소가 있는 곳.  </w:t>
         <w:br/>
-        <w:t xml:space="preserve">   뭉친 근육도, 지친 마음도 기분 좋게 풀어드립니다!</w:t>
+        <w:t xml:space="preserve">   당신의 하루를 더 예쁘게 채워줄 별다방.</w:t>
         <w:br/>
         <w:br/>
-        <w:t xml:space="preserve">3. **피로야, 너 오늘 퇴근이다!**  </w:t>
+        <w:t xml:space="preserve">3. **별처럼 빛나는 당신의 휴식 시간**  </w:t>
         <w:br/>
-        <w:t xml:space="preserve">   매일매일 받고 싶은 편안함,  </w:t>
+        <w:t xml:space="preserve">   깔끔한 분위기, 맛있는 메뉴, 편안한 자리까지.  </w:t>
         <w:br/>
-        <w:t xml:space="preserve">   7일 내내 기분 좋아지는 곳 **7day’s massage** ✨</w:t>
+        <w:t xml:space="preserve">   한 번 오면 다시 찾고 싶은 카페, 별다방.</w:t>
       </w:r>
     </w:p>
     <w:sectPr>

</xml_diff>

<commit_message>
Add admin dashboard and AI emergency stop system
</commit_message>
<xml_diff>
--- a/downloads/advertisement.docx
+++ b/downloads/advertisement.docx
@@ -23,7 +23,7 @@
               <a:graphicData uri="http://schemas.openxmlformats.org/drawingml/2006/picture">
                 <pic:pic>
                   <pic:nvPicPr>
-                    <pic:cNvPr id="0" name="image_20260812_200343_30670e4a.jpg"/>
+                    <pic:cNvPr id="0" name="image_20260813_100206_f3de4efe.jpg"/>
                     <pic:cNvPicPr/>
                   </pic:nvPicPr>
                   <pic:blipFill>
@@ -48,25 +48,29 @@
     </w:p>
     <w:p>
       <w:r>
-        <w:t xml:space="preserve">1. **머물수록 기분 좋은 곳, 별다방**  </w:t>
+        <w:t xml:space="preserve">1. **무릎이 “삐걱” 말 걸 때, 삼성필정형외과의원으로!**  </w:t>
         <w:br/>
-        <w:t xml:space="preserve">   깨끗한 공간, 향긋한 커피, 달콤한 디저트까지.  </w:t>
-        <w:br/>
-        <w:t xml:space="preserve">   오늘도 오래 있고 싶은 카페, 별다방입니다.</w:t>
+        <w:t xml:space="preserve">   관절이 보내는 신호, 웃으며 넘기지 말고 진료로 확인해보세요.</w:t>
         <w:br/>
         <w:br/>
-        <w:t xml:space="preserve">2. **커피 한 잔에 달콤한 여유를 더하다**  </w:t>
+        <w:t xml:space="preserve">2. **허리가 파업 선언하기 전에!**  </w:t>
         <w:br/>
-        <w:t xml:space="preserve">   맛있는 커피와 다양한 디저트, 친절한 미소가 있는 곳.  </w:t>
-        <w:br/>
-        <w:t xml:space="preserve">   당신의 하루를 더 예쁘게 채워줄 별다방.</w:t>
+        <w:t xml:space="preserve">   오래 앉아도, 오래 서 있어도 불편하다면 삼성필정형외과의원에서 상담해보세요.</w:t>
         <w:br/>
         <w:br/>
-        <w:t xml:space="preserve">3. **별처럼 빛나는 당신의 휴식 시간**  </w:t>
+        <w:t xml:space="preserve">3. **어깨가 굳었다고요? 냉동고에 넣은 적 없는데!**  </w:t>
         <w:br/>
-        <w:t xml:space="preserve">   깔끔한 분위기, 맛있는 메뉴, 편안한 자리까지.  </w:t>
+        <w:t xml:space="preserve">   뻐근한 어깨 통증, 삼성필정형외과의원에서 꼼꼼히 살펴드립니다.</w:t>
         <w:br/>
-        <w:t xml:space="preserve">   한 번 오면 다시 찾고 싶은 카페, 별다방.</w:t>
+        <w:br/>
+        <w:t xml:space="preserve">4. **“아이고”가 입버릇이 되기 전에**  </w:t>
+        <w:br/>
+        <w:t xml:space="preserve">   일상 속 통증 관리, 삼성필정형외과의원과 함께 시작하세요.</w:t>
+        <w:br/>
+        <w:br/>
+        <w:t xml:space="preserve">5. **관절도 야근하면 힘듭니다**  </w:t>
+        <w:br/>
+        <w:t xml:space="preserve">   손목, 무릎, 허리 통증이 반복된다면 삼성필정형외과의원에서 진료받아보세요.</w:t>
       </w:r>
     </w:p>
     <w:sectPr>

</xml_diff>

<commit_message>
Add PRO brand limits and ZIP download restrictions
</commit_message>
<xml_diff>
--- a/downloads/advertisement.docx
+++ b/downloads/advertisement.docx
@@ -23,7 +23,7 @@
               <a:graphicData uri="http://schemas.openxmlformats.org/drawingml/2006/picture">
                 <pic:pic>
                   <pic:nvPicPr>
-                    <pic:cNvPr id="0" name="image_20260813_100206_f3de4efe.jpg"/>
+                    <pic:cNvPr id="0" name="image_20260813_103801_ded69b4b.jpg"/>
                     <pic:cNvPicPr/>
                   </pic:nvPicPr>
                   <pic:blipFill>
@@ -48,29 +48,25 @@
     </w:p>
     <w:p>
       <w:r>
-        <w:t xml:space="preserve">1. **무릎이 “삐걱” 말 걸 때, 삼성필정형외과의원으로!**  </w:t>
+        <w:t xml:space="preserve">1. **파타야 여행, 피로는 7day’s에 두고 가세요!**  </w:t>
         <w:br/>
-        <w:t xml:space="preserve">   관절이 보내는 신호, 웃으며 넘기지 말고 진료로 확인해보세요.</w:t>
+        <w:t xml:space="preserve">   걷고, 놀고, 먹느라 지친 몸!  </w:t>
+        <w:br/>
+        <w:t xml:space="preserve">   **7day’s massage**에서 시원하게 풀고 다시 신나게 출발하세요.</w:t>
         <w:br/>
         <w:br/>
-        <w:t xml:space="preserve">2. **허리가 파업 선언하기 전에!**  </w:t>
+        <w:t xml:space="preserve">2. **오늘도 마사지각? 7day’s는 매일 환영합니다!**  </w:t>
         <w:br/>
-        <w:t xml:space="preserve">   오래 앉아도, 오래 서 있어도 불편하다면 삼성필정형외과의원에서 상담해보세요.</w:t>
+        <w:t xml:space="preserve">   월화수목금토일, 언제 와도 OK!  </w:t>
+        <w:br/>
+        <w:t xml:space="preserve">   파타야에서 기분 좋은 힐링 타임은 **7day’s massage**로!</w:t>
         <w:br/>
         <w:br/>
-        <w:t xml:space="preserve">3. **어깨가 굳었다고요? 냉동고에 넣은 적 없는데!**  </w:t>
+        <w:t xml:space="preserve">3. **발은 “살려줘”, 어깨는 “살려줘”… 그럴 땐 7day’s!**  </w:t>
         <w:br/>
-        <w:t xml:space="preserve">   뻐근한 어깨 통증, 삼성필정형외과의원에서 꼼꼼히 살펴드립니다.</w:t>
+        <w:t xml:space="preserve">   여행 피로부터 뭉친 근육까지 시원하게 케어!  </w:t>
         <w:br/>
-        <w:br/>
-        <w:t xml:space="preserve">4. **“아이고”가 입버릇이 되기 전에**  </w:t>
-        <w:br/>
-        <w:t xml:space="preserve">   일상 속 통증 관리, 삼성필정형외과의원과 함께 시작하세요.</w:t>
-        <w:br/>
-        <w:br/>
-        <w:t xml:space="preserve">5. **관절도 야근하면 힘듭니다**  </w:t>
-        <w:br/>
-        <w:t xml:space="preserve">   손목, 무릎, 허리 통증이 반복된다면 삼성필정형외과의원에서 진료받아보세요.</w:t>
+        <w:t xml:space="preserve">   웃음 나오는 개운함, **7day’s massage**에서 만나보세요.</w:t>
       </w:r>
     </w:p>
     <w:sectPr>

</xml_diff>

<commit_message>
Add auth protection, OpenAI cost guard and image style controls
</commit_message>
<xml_diff>
--- a/downloads/advertisement.docx
+++ b/downloads/advertisement.docx
@@ -23,7 +23,7 @@
               <a:graphicData uri="http://schemas.openxmlformats.org/drawingml/2006/picture">
                 <pic:pic>
                   <pic:nvPicPr>
-                    <pic:cNvPr id="0" name="image_20260813_103801_ded69b4b.jpg"/>
+                    <pic:cNvPr id="0" name="image_20260813_124415_db5ae7b0.jpg"/>
                     <pic:cNvPicPr/>
                   </pic:nvPicPr>
                   <pic:blipFill>
@@ -48,25 +48,29 @@
     </w:p>
     <w:p>
       <w:r>
-        <w:t xml:space="preserve">1. **파타야 여행, 피로는 7day’s에 두고 가세요!**  </w:t>
+        <w:t xml:space="preserve">1. **커피 한 잔으로 마음까지 마사지!**  </w:t>
         <w:br/>
-        <w:t xml:space="preserve">   걷고, 놀고, 먹느라 지친 몸!  </w:t>
-        <w:br/>
-        <w:t xml:space="preserve">   **7day’s massage**에서 시원하게 풀고 다시 신나게 출발하세요.</w:t>
+        <w:t xml:space="preserve">   7day's massage에서 오늘의 피로를 달콤하게 풀어보세요.</w:t>
         <w:br/>
         <w:br/>
-        <w:t xml:space="preserve">2. **오늘도 마사지각? 7day’s는 매일 환영합니다!**  </w:t>
+        <w:t xml:space="preserve">2. **월화수목금토일, 커피는 7day's!**  </w:t>
         <w:br/>
-        <w:t xml:space="preserve">   월화수목금토일, 언제 와도 OK!  </w:t>
-        <w:br/>
-        <w:t xml:space="preserve">   파타야에서 기분 좋은 힐링 타임은 **7day’s massage**로!</w:t>
+        <w:t xml:space="preserve">   매일 생각나는 웃긴 이름, 더 생각나는 맛있는 한 잔.</w:t>
         <w:br/>
         <w:br/>
-        <w:t xml:space="preserve">3. **발은 “살려줘”, 어깨는 “살려줘”… 그럴 땐 7day’s!**  </w:t>
+        <w:t xml:space="preserve">3. **마사지 받으러 왔다가 커피에 반하다!**  </w:t>
         <w:br/>
-        <w:t xml:space="preserve">   여행 피로부터 뭉친 근육까지 시원하게 케어!  </w:t>
+        <w:t xml:space="preserve">   7day's massage, 이름은 반전! 분위기는 완전 취향저격.</w:t>
         <w:br/>
-        <w:t xml:space="preserve">   웃음 나오는 개운함, **7day’s massage**에서 만나보세요.</w:t>
+        <w:br/>
+        <w:t xml:space="preserve">4. **피곤한 하루엔 카페인 마사지가 필요해요.**  </w:t>
+        <w:br/>
+        <w:t xml:space="preserve">   7day's massage에서 기분까지 쭉 풀리는 커피 타임!</w:t>
+        <w:br/>
+        <w:br/>
+        <w:t xml:space="preserve">5. **여기 카페 맞아요! 그런데 힐링은 진짜예요.**  </w:t>
+        <w:br/>
+        <w:t xml:space="preserve">   재밌고 편안한 공간, 7day's massage에서 만나요.</w:t>
       </w:r>
     </w:p>
     <w:sectPr>

</xml_diff>

<commit_message>
Unify generator UI and improve credit system
</commit_message>
<xml_diff>
--- a/downloads/advertisement.docx
+++ b/downloads/advertisement.docx
@@ -23,7 +23,7 @@
               <a:graphicData uri="http://schemas.openxmlformats.org/drawingml/2006/picture">
                 <pic:pic>
                   <pic:nvPicPr>
-                    <pic:cNvPr id="0" name="image_20260813_124415_db5ae7b0.jpg"/>
+                    <pic:cNvPr id="0" name="image_20260813_144804_7b887144.jpg"/>
                     <pic:cNvPicPr/>
                   </pic:nvPicPr>
                   <pic:blipFill>
@@ -48,29 +48,29 @@
     </w:p>
     <w:p>
       <w:r>
-        <w:t xml:space="preserve">1. **커피 한 잔으로 마음까지 마사지!**  </w:t>
+        <w:t xml:space="preserve">1. **처음 뛰는 사람도, 다시 뛰는 사람도**  </w:t>
         <w:br/>
-        <w:t xml:space="preserve">   7day's massage에서 오늘의 피로를 달콤하게 풀어보세요.</w:t>
+        <w:t xml:space="preserve">   런바디스튜디오에서 쉽고 재밌게 배우는 부상 없는 러닝!</w:t>
         <w:br/>
         <w:br/>
-        <w:t xml:space="preserve">2. **월화수목금토일, 커피는 7day's!**  </w:t>
+        <w:t xml:space="preserve">2. **달리기는 힘든 운동이 아닙니다**  </w:t>
         <w:br/>
-        <w:t xml:space="preserve">   매일 생각나는 웃긴 이름, 더 생각나는 맛있는 한 잔.</w:t>
+        <w:t xml:space="preserve">   내 몸에 맞는 자세와 훈련으로 더 가볍고 즐겁게 달려보세요.</w:t>
         <w:br/>
         <w:br/>
-        <w:t xml:space="preserve">3. **마사지 받으러 왔다가 커피에 반하다!**  </w:t>
+        <w:t xml:space="preserve">3. **혼자 뛰다 포기했다면, 이제 함께 달려요**  </w:t>
         <w:br/>
-        <w:t xml:space="preserve">   7day's massage, 이름은 반전! 분위기는 완전 취향저격.</w:t>
+        <w:t xml:space="preserve">   런바디스튜디오에서 재미있는 러닝 훈련과 건강한 습관을 시작하세요.</w:t>
         <w:br/>
         <w:br/>
-        <w:t xml:space="preserve">4. **피곤한 하루엔 카페인 마사지가 필요해요.**  </w:t>
+        <w:t xml:space="preserve">4. **빠르게보다 바르게 달리는 곳**  </w:t>
         <w:br/>
-        <w:t xml:space="preserve">   7day's massage에서 기분까지 쭉 풀리는 커피 타임!</w:t>
+        <w:t xml:space="preserve">   부상 걱정은 줄이고, 러닝의 즐거움은 키우는 런바디스튜디오.</w:t>
         <w:br/>
         <w:br/>
-        <w:t xml:space="preserve">5. **여기 카페 맞아요! 그런데 힐링은 진짜예요.**  </w:t>
+        <w:t xml:space="preserve">5. **러닝, 제대로 배우면 오래 즐길 수 있습니다**  </w:t>
         <w:br/>
-        <w:t xml:space="preserve">   재밌고 편안한 공간, 7day's massage에서 만나요.</w:t>
+        <w:t xml:space="preserve">   누구나 쉽게 따라 하는 맞춤 훈련으로 나만의 달리기를 완성하세요.</w:t>
       </w:r>
     </w:p>
     <w:sectPr>

</xml_diff>

<commit_message>
Add test payment system and admin payment dashboard
</commit_message>
<xml_diff>
--- a/downloads/advertisement.docx
+++ b/downloads/advertisement.docx
@@ -23,7 +23,7 @@
               <a:graphicData uri="http://schemas.openxmlformats.org/drawingml/2006/picture">
                 <pic:pic>
                   <pic:nvPicPr>
-                    <pic:cNvPr id="0" name="image_20260813_144804_7b887144.jpg"/>
+                    <pic:cNvPr id="0" name="image_20260813_182401_cdc68e39.jpg"/>
                     <pic:cNvPicPr/>
                   </pic:nvPicPr>
                   <pic:blipFill>
@@ -48,29 +48,25 @@
     </w:p>
     <w:p>
       <w:r>
-        <w:t xml:space="preserve">1. **처음 뛰는 사람도, 다시 뛰는 사람도**  </w:t>
+        <w:t xml:space="preserve">1. **월화수목금토일, 피로는 쉬는 날!**  </w:t>
         <w:br/>
-        <w:t xml:space="preserve">   런바디스튜디오에서 쉽고 재밌게 배우는 부상 없는 러닝!</w:t>
+        <w:t xml:space="preserve">   매일 받고 싶은 힐링 한 스푼,  </w:t>
+        <w:br/>
+        <w:t xml:space="preserve">   **7day's massage**에서 몸도 마음도 웃게 해드릴게요.</w:t>
         <w:br/>
         <w:br/>
-        <w:t xml:space="preserve">2. **달리기는 힘든 운동이 아닙니다**  </w:t>
+        <w:t xml:space="preserve">2. **어깨가 “살려줘…” 할 때!**  </w:t>
         <w:br/>
-        <w:t xml:space="preserve">   내 몸에 맞는 자세와 훈련으로 더 가볍고 즐겁게 달려보세요.</w:t>
+        <w:t xml:space="preserve">   뭉친 피로는 풀고, 기분은 말랑말랑하게!  </w:t>
+        <w:br/>
+        <w:t xml:space="preserve">   오늘의 귀여운 힐링은 **7day's massage**에서 시작하세요.</w:t>
         <w:br/>
         <w:br/>
-        <w:t xml:space="preserve">3. **혼자 뛰다 포기했다면, 이제 함께 달려요**  </w:t>
+        <w:t xml:space="preserve">3. **피로야, 우리 이제 그만 만나자!**  </w:t>
         <w:br/>
-        <w:t xml:space="preserve">   런바디스튜디오에서 재미있는 러닝 훈련과 건강한 습관을 시작하세요.</w:t>
+        <w:t xml:space="preserve">   지친 하루 끝에 찾아오는 포근한 손길,  </w:t>
         <w:br/>
-        <w:br/>
-        <w:t xml:space="preserve">4. **빠르게보다 바르게 달리는 곳**  </w:t>
-        <w:br/>
-        <w:t xml:space="preserve">   부상 걱정은 줄이고, 러닝의 즐거움은 키우는 런바디스튜디오.</w:t>
-        <w:br/>
-        <w:br/>
-        <w:t xml:space="preserve">5. **러닝, 제대로 배우면 오래 즐길 수 있습니다**  </w:t>
-        <w:br/>
-        <w:t xml:space="preserve">   누구나 쉽게 따라 하는 맞춤 훈련으로 나만의 달리기를 완성하세요.</w:t>
+        <w:t xml:space="preserve">   사랑스럽게 풀어주는 **7day's massage**로 오세요.</w:t>
       </w:r>
     </w:p>
     <w:sectPr>

</xml_diff>

<commit_message>
Complete multilingual V4 AI content generation
</commit_message>
<xml_diff>
--- a/downloads/advertisement.docx
+++ b/downloads/advertisement.docx
@@ -23,7 +23,7 @@
               <a:graphicData uri="http://schemas.openxmlformats.org/drawingml/2006/picture">
                 <pic:pic>
                   <pic:nvPicPr>
-                    <pic:cNvPr id="0" name="image_20260813_182401_cdc68e39.jpg"/>
+                    <pic:cNvPr id="0" name="image_20260814_101850_9b3390f9.jpg"/>
                     <pic:cNvPicPr/>
                   </pic:nvPicPr>
                   <pic:blipFill>
@@ -48,25 +48,19 @@
     </w:p>
     <w:p>
       <w:r>
-        <w:t xml:space="preserve">1. **월화수목금토일, 피로는 쉬는 날!**  </w:t>
-        <w:br/>
-        <w:t xml:space="preserve">   매일 받고 싶은 힐링 한 스푼,  </w:t>
-        <w:br/>
-        <w:t xml:space="preserve">   **7day's massage**에서 몸도 마음도 웃게 해드릴게요.</w:t>
+        <w:t>1. เหนื่อยล้าทั้งสัปดาห์? ให้ 7day's massage นวดคลายให้ฟินทุกวัน 💆‍♀️✨</w:t>
         <w:br/>
         <w:br/>
-        <w:t xml:space="preserve">2. **어깨가 “살려줘…” 할 때!**  </w:t>
-        <w:br/>
-        <w:t xml:space="preserve">   뭉친 피로는 풀고, 기분은 말랑말랑하게!  </w:t>
-        <w:br/>
-        <w:t xml:space="preserve">   오늘의 귀여운 힐링은 **7day's massage**에서 시작하세요.</w:t>
+        <w:t>2. ปวดหลัง ปวดไหล่ ปวดใจนิดหน่อย… แวะมา 7day's massage เดี๋ยวเราช่วยคลายให้ 😄</w:t>
         <w:br/>
         <w:br/>
-        <w:t xml:space="preserve">3. **피로야, 우리 이제 그만 만나자!**  </w:t>
+        <w:t>3. ชีวิตตึงแค่ไหน กล้ามเนื้ออย่าตึงตาม! มานวดชิล ๆ ที่ 7day's massage</w:t>
         <w:br/>
-        <w:t xml:space="preserve">   지친 하루 끝에 찾아오는 포근한 손길,  </w:t>
         <w:br/>
-        <w:t xml:space="preserve">   사랑스럽게 풀어주는 **7day's massage**로 오세요.</w:t>
+        <w:t>4. รีเซ็ตร่างกายให้สดใส เหมือนได้วันหยุดเพิ่มอีกวัน ที่ 7day's massage 🌿</w:t>
+        <w:br/>
+        <w:br/>
+        <w:t>5. เมื่อยเมื่อไหร่ก็มาได้ เพราะความสบายเปิดรับคุณทุกวันกับ 7day's massage 💛</w:t>
       </w:r>
     </w:p>
     <w:sectPr>

</xml_diff>